<commit_message>
fix: mise à jour règles métier dans documentation Word
- BANQUE DE FRANCE: exclusion → onglet dédié (DOCUMENTATION_TECHNIQUE)
- BC/F21: ajout annulation si receiver SCBLGB2LXXX/CITIGB2LXXX (DOCUMENTATION_TECHNIQUE + ARCHITECTURE)
- BEACCMCX091: ajout annulation si sender BEACCMCX + receiver SCBLGB2LXXX/CITIGB2LXXX (DOCUMENTATION_TECHNIQUE + ARCHITECTURE)
- Date corrigée: 20 juin 2025 → 20 février 2026 (GUIDE_TECHNIQUE + GUIDE_UTILISATEUR)
</commit_message>
<xml_diff>
--- a/ARCHITECTURE_SWIFT_EXTRACTOR.docx
+++ b/ARCHITECTURE_SWIFT_EXTRACTOR.docx
@@ -4082,11 +4082,8 @@
             <w:tcW w:w="2880" w:type="dxa"/>
           </w:tcPr>
           <w:p>
-            <w:pPr>
-              <w:cnfStyle w:val="000000100000" w:firstRow="0" w:lastRow="0" w:firstColumn="0" w:lastColumn="0" w:oddVBand="0" w:evenVBand="0" w:oddHBand="1" w:evenHBand="0" w:firstRowFirstColumn="0" w:firstRowLastColumn="0" w:lastRowFirstColumn="0" w:lastRowLastColumn="0"/>
-            </w:pPr>
-            <w:r>
-              <w:t>-</w:t>
+            <w:r>
+              <w:t>Annulée si sender BEACCMCX + receiver SCBLGB2LXXX ou CITIGB2LXXX</w:t>
             </w:r>
           </w:p>
         </w:tc>
@@ -4124,11 +4121,10 @@
             <w:tcW w:w="2880" w:type="dxa"/>
           </w:tcPr>
           <w:p>
-            <w:pPr>
-              <w:cnfStyle w:val="000000010000" w:firstRow="0" w:lastRow="0" w:firstColumn="0" w:lastColumn="0" w:oddVBand="0" w:evenVBand="0" w:oddHBand="0" w:evenHBand="1" w:firstRowFirstColumn="0" w:firstRowLastColumn="0" w:lastRowFirstColumn="0" w:lastRowLastColumn="0"/>
-            </w:pPr>
             <w:r>
               <w:t>"opération salle des marchés"</w:t>
+              <w:br/>
+              <w:t>Annulée si receiver = SCBLGB2LXXX ou CITIGB2LXXX</w:t>
             </w:r>
           </w:p>
         </w:tc>

</xml_diff>

<commit_message>
feat: exception forex - fallback F50A pour CITIUS33+USD
- Règle 2 forex: si correspondant CITIUS33 + devise USD, cherche codes forex dans F50A
- Documentation technique GUIDE_TECHNIQUE.md mise à jour (section 10.8)
- DOCUMENTATION_TECHNIQUE_SWIFT_EXTRACTOR.docx section 5.8 mise à jour
- ARCHITECTURE_SWIFT_EXTRACTOR.docx section 6.4 mise à jour
- Synchronisation livraison_dsi
</commit_message>
<xml_diff>
--- a/ARCHITECTURE_SWIFT_EXTRACTOR.docx
+++ b/ARCHITECTURE_SWIFT_EXTRACTOR.docx
@@ -2648,10 +2648,7 @@
         <w:pStyle w:val="ListBullet"/>
       </w:pPr>
       <w:r>
-        <w:rPr>
-          <w:sz w:val="20"/>
-        </w:rPr>
-        <w:t>Forex (code dans liste bic_codes.xlsx/forex)</w:t>
+        <w:t>Forex (code dans liste bic_codes.xlsx/forex ; fallback F50A si correspondant CITIUS33 + devise USD)</w:t>
       </w:r>
     </w:p>
     <w:p>

</xml_diff>

<commit_message>
docs: mise à jour documentation v5.0 — règles BdF, exception correspondants, Exceptions_Correspondants sheet
- ARCHITECTURE_SWIFT_EXTRACTOR.docx : version 5.0, sections 6.8/6.9 (BdF + exceptions correspondants), renumbering
- DOCUMENTATION_TECHNIQUE_SWIFT_EXTRACTOR.docx : version 5.0, sections 5.11/5.12 (BdF + exceptions correspondants), Table 19 updated
- GUIDE_TECHNIQUE.md : version 5.0
- GUIDE_UTILISATEUR.md : version 5.0, ajout Exceptions_Correspondants dans onglets spéciaux
</commit_message>
<xml_diff>
--- a/ARCHITECTURE_SWIFT_EXTRACTOR.docx
+++ b/ARCHITECTURE_SWIFT_EXTRACTOR.docx
@@ -26,7 +26,7 @@
           <w:color w:val="808080"/>
           <w:sz w:val="20"/>
         </w:rPr>
-        <w:t>Version 4.0 — Février 2026</w:t>
+        <w:t>Version 5.0 — Mars 2026</w:t>
       </w:r>
     </w:p>
     <w:p/>
@@ -681,7 +681,7 @@
           <w:i w:val="0"/>
           <w:sz w:val="20"/>
         </w:rPr>
-        <w:t>A. Dispatcher Principal — extractors/mt_multi.py (~1750 lignes)</w:t>
+        <w:t>A. Dispatcher Principal — extractors/mt_multi.py (~1900 lignes)</w:t>
       </w:r>
     </w:p>
     <w:p>
@@ -768,7 +768,7 @@
         <w:rPr>
           <w:sz w:val="20"/>
         </w:rPr>
-        <w:t>Retour de 7 listes classifiées</w:t>
+        <w:t>Retour de 8 listes classifiées</w:t>
       </w:r>
     </w:p>
     <w:p>
@@ -1122,7 +1122,7 @@
         <w:rPr>
           <w:sz w:val="20"/>
         </w:rPr>
-        <w:t>BANQUE DE FRANCE, forex</w:t>
+        <w:t>BANQUE DE FRANCE, forex, Exceptions Correspondants</w:t>
       </w:r>
     </w:p>
     <w:p>
@@ -1484,7 +1484,7 @@
         <w:rPr>
           <w:sz w:val="20"/>
         </w:rPr>
-        <w:t>Application des règles d'exception (BEACCMCX091, BC, 323201, EUR, nivellement, forex, BDF, salle marchés)</w:t>
+        <w:t>Application des règles d'exception (BEACCMCX091, BC, 323201, EUR, nivellement, forex, BDF, salle marchés, correspondants BdF)</w:t>
       </w:r>
     </w:p>
     <w:p>
@@ -1514,7 +1514,7 @@
         <w:rPr>
           <w:sz w:val="20"/>
         </w:rPr>
-        <w:t>Tous les messages traités sont agrégés dans les 7 listes</w:t>
+        <w:t>Tous les messages traités sont agrégés dans les 8 listes</w:t>
       </w:r>
     </w:p>
     <w:p>
@@ -2845,7 +2845,7 @@
           <w:i w:val="0"/>
           <w:sz w:val="20"/>
         </w:rPr>
-        <w:t>MT103 sortants :</w:t>
+        <w:t>MT103 sortants (non-BdF) :</w:t>
       </w:r>
     </w:p>
     <w:p>
@@ -2894,10 +2894,74 @@
     </w:p>
     <w:p>
       <w:pPr>
+        <w:pStyle w:val="ListBullet"/>
+      </w:pPr>
+      <w:r>
+        <w:t xml:space="preserve">SCBLGB2LXXX : CITIUS33 dans F57A ET 36357124 dans F58A → feuille Exceptions_Correspondants</w:t>
+      </w:r>
+    </w:p>
+    <w:p>
+      <w:pPr>
+        <w:pStyle w:val="ListBullet"/>
+      </w:pPr>
+      <w:r>
+        <w:t xml:space="preserve">CITIGB2LXXX : BIC Banque de France dans F57A → feuille Exceptions_Correspondants</w:t>
+      </w:r>
+    </w:p>
+    <w:p>
+      <w:pPr>
         <w:pStyle w:val="Heading2"/>
       </w:pPr>
       <w:r>
-        <w:t>6.8 Rapprochement MT950</w:t>
+        <w:t xml:space="preserve">6.9 Exception Correspondants BdF (MT202 sortant)</w:t>
+      </w:r>
+    </w:p>
+    <w:p>
+      <w:pPr>
+        <w:pStyle w:val="ListBullet"/>
+      </w:pPr>
+      <w:r>
+        <w:t xml:space="preserve">MT202 sortants CITI/SCB : donneur d'ordre = bénéficiaire (copié depuis F58A)</w:t>
+      </w:r>
+    </w:p>
+    <w:p>
+      <w:pPr>
+        <w:pStyle w:val="ListBullet"/>
+      </w:pPr>
+      <w:r>
+        <w:t xml:space="preserve">MT202 entrants BdF : Fallback F58A si F52A non mappé (P1=BIC strict, P2=code 4 chiffres → Reglement)</w:t>
+      </w:r>
+    </w:p>
+    <w:p>
+      <w:pPr>
+        <w:pStyle w:val="ListBullet"/>
+      </w:pPr>
+      <w:r>
+        <w:t xml:space="preserve">MT103 sortants BdF : Priorités inversées — P2=Nom (Details F50F), P3=CCF, P4=BIC (F52A)</w:t>
+      </w:r>
+    </w:p>
+    <w:p>
+      <w:pPr>
+        <w:pStyle w:val="ListBullet"/>
+      </w:pPr>
+      <w:r>
+        <w:t xml:space="preserve">MT103 entrants BdF : PAYS rempli depuis le RECEIVER BIC (quand le sender est BDFEFRPPCCT/BDFEFRPPSRD)</w:t>
+      </w:r>
+    </w:p>
+    <w:p>
+      <w:pPr>
+        <w:pStyle w:val="Heading2"/>
+      </w:pPr>
+      <w:r>
+        <w:t xml:space="preserve">6.8 Règles Banque de France (BdF)</w:t>
+      </w:r>
+    </w:p>
+    <w:p>
+      <w:pPr>
+        <w:pStyle w:val="Heading2"/>
+      </w:pPr>
+      <w:r>
+        <w:t>6.10 Rapprochement MT950</w:t>
       </w:r>
     </w:p>
     <w:p>
@@ -3640,7 +3704,7 @@
         <w:rPr>
           <w:sz w:val="20"/>
         </w:rPr>
-        <w:t>Règles métier précises : 9+ exceptions différentes gérées automatiquement</w:t>
+        <w:t>Règles métier précises : 10+ exceptions différentes gérées automatiquement</w:t>
       </w:r>
     </w:p>
     <w:p>

</xml_diff>